<commit_message>
docs/ideas: overview cleanup + web-browser/HttpClient ideas
- docs/01-PROJECT-OVERVIEW.md: drop the "note on the name" callout, fix a caption
  typo ("Onyx's Onyx desktop" -> "The Onyx desktop").
- IDEAS.md: add a web browser idea + an HttpClient library idea (both on the v21
  TCP sockets; HTTP only, no native TLS).
- Regenerate the Word/PDF exports to match.

Co-Authored-By: Claude Opus 4.8 <noreply@anthropic.com>
</commit_message>
<xml_diff>
--- a/docs/exports/01-PROJECT-OVERVIEW.docx
+++ b/docs/exports/01-PROJECT-OVERVIEW.docx
@@ -16,118 +16,6 @@
       </w:pPr>
       <w:r>
         <w:t xml:space="preserve">Onyx · multi-process OS on Raspberry Pi 4</w:t>
-      </w:r>
-    </w:p>
-    <w:p>
-      <w:pPr>
-        <w:pStyle w:val="BlockText"/>
-      </w:pPr>
-      <w:r>
-        <w:rPr>
-          <w:b/>
-          <w:bCs/>
-        </w:rPr>
-        <w:t xml:space="preserve">A note on the name.</w:t>
-      </w:r>
-      <w:r>
-        <w:t xml:space="preserve"> </w:t>
-      </w:r>
-      <w:r>
-        <w:rPr>
-          <w:b/>
-          <w:bCs/>
-        </w:rPr>
-        <w:t xml:space="preserve">Onyx</w:t>
-      </w:r>
-      <w:r>
-        <w:t xml:space="preserve"> </w:t>
-      </w:r>
-      <w:r>
-        <w:t xml:space="preserve">is the name of the OS, its kernel, and its GUI.</w:t>
-      </w:r>
-      <w:r>
-        <w:t xml:space="preserve"> </w:t>
-      </w:r>
-      <w:r>
-        <w:t xml:space="preserve">The repository folder is historically named</w:t>
-      </w:r>
-      <w:r>
-        <w:t xml:space="preserve"> </w:t>
-      </w:r>
-      <w:r>
-        <w:rPr>
-          <w:rStyle w:val="VerbatimChar"/>
-        </w:rPr>
-        <w:t xml:space="preserve">Zircon/</w:t>
-      </w:r>
-      <w:r>
-        <w:t xml:space="preserve"> </w:t>
-      </w:r>
-      <w:r>
-        <w:t xml:space="preserve">(a legacy name; unrelated to</w:t>
-      </w:r>
-      <w:r>
-        <w:t xml:space="preserve"> </w:t>
-      </w:r>
-      <w:r>
-        <w:t xml:space="preserve">Google/Fuchsia's</w:t>
-      </w:r>
-      <w:r>
-        <w:t xml:space="preserve"> </w:t>
-      </w:r>
-      <w:r>
-        <w:rPr>
-          <w:i/>
-          <w:iCs/>
-        </w:rPr>
-        <w:t xml:space="preserve">Zircon</w:t>
-      </w:r>
-      <w:r>
-        <w:t xml:space="preserve"> </w:t>
-      </w:r>
-      <w:r>
-        <w:t xml:space="preserve">microkernel or to</w:t>
-      </w:r>
-      <w:r>
-        <w:t xml:space="preserve"> </w:t>
-      </w:r>
-      <w:r>
-        <w:rPr>
-          <w:i/>
-          <w:iCs/>
-        </w:rPr>
-        <w:t xml:space="preserve">LK</w:t>
-      </w:r>
-      <w:r>
-        <w:t xml:space="preserve">). Onyx is a homemade operating system,</w:t>
-      </w:r>
-      <w:r>
-        <w:t xml:space="preserve"> </w:t>
-      </w:r>
-      <w:r>
-        <w:t xml:space="preserve">written from scratch, that builds on the</w:t>
-      </w:r>
-      <w:r>
-        <w:t xml:space="preserve"> </w:t>
-      </w:r>
-      <w:r>
-        <w:rPr>
-          <w:b/>
-          <w:bCs/>
-        </w:rPr>
-        <w:t xml:space="preserve">Circle</w:t>
-      </w:r>
-      <w:r>
-        <w:t xml:space="preserve"> </w:t>
-      </w:r>
-      <w:r>
-        <w:t xml:space="preserve">bare-metal framework as its</w:t>
-      </w:r>
-      <w:r>
-        <w:t xml:space="preserve"> </w:t>
-      </w:r>
-      <w:r>
-        <w:t xml:space="preserve">hardware abstraction layer.</w:t>
       </w:r>
     </w:p>
     <w:bookmarkStart w:id="22" w:name="X14dbb8d34989bbb6ce0a693749d87edcb6cab80"/>
@@ -316,7 +204,7 @@
           <wp:inline>
             <wp:extent cx="5334000" cy="4000500"/>
             <wp:effectExtent b="0" l="0" r="0" t="0"/>
-            <wp:docPr descr="Onyx's Onyx desktop" title="" id="20" name="Picture"/>
+            <wp:docPr descr="The Onyx desktop" title="" id="20" name="Picture"/>
             <a:graphic>
               <a:graphicData uri="http://schemas.openxmlformats.org/drawingml/2006/picture">
                 <pic:pic>

</xml_diff>